<commit_message>
Regenerate advanced DOCX with corrected styles
</commit_message>
<xml_diff>
--- a/adv/edits & guides/style edits/step2-stylereference/aw_textbook_clean_reference.docx
+++ b/adv/edits & guides/style edits/step2-stylereference/aw_textbook_clean_reference.docx
@@ -12730,6 +12730,40 @@
     </w:rPr>
     <w:link w:val="LearnNote"/>
   </w:style>
+  <w:style w:type="paragraph" w:customStyle="1" w:styleId="Model">
+    <w:name w:val="Model"/>
+    <w:basedOn w:val="BodyText"/>
+    <w:next w:val="BodyText"/>
+    <w:rPr>
+      <w:rFonts w:ascii="Congenial" w:hAnsi="Congenial" w:eastAsia="Congenial" w:cs="Congenial"/>
+      <w:sz w:val="20"/>
+      <w:szCs w:val="20"/>
+      <w:color w:val="2D2D2D"/>
+      <w:b w:val="0"/>
+    </w:rPr>
+    <w:pPr>
+      <w:spacing w:before="200" w:after="200" w:line="288" w:lineRule="auto"/>
+      <w:ind w:left="198" w:right="198"/>
+      <w:jc w:val="left"/>
+      <w:widowControl/>
+      <w:shd w:val="clear" w:fill="F7FAFC"/>
+      <w:pBdr>
+        <w:left w:val="single" w:sz="36" w:space="3" w:color="56768C"/>
+      </w:pBdr>
+    </w:pPr>
+    <w:link w:val="ModelChar"/>
+  </w:style>
+  <w:style w:type="character" w:customStyle="1" w:styleId="ModelChar">
+    <w:name w:val="Model Char"/>
+    <w:rPr>
+      <w:rFonts w:ascii="Congenial" w:hAnsi="Congenial" w:eastAsia="Congenial" w:cs="Congenial"/>
+      <w:sz w:val="20"/>
+      <w:szCs w:val="20"/>
+      <w:color w:val="2D2D2D"/>
+      <w:b w:val="0"/>
+    </w:rPr>
+    <w:link w:val="Model"/>
+  </w:style>
   <w:style w:type="paragraph" w:customStyle="1" w:styleId="ModelBad">
     <w:name w:val="Model Bad"/>
     <w:basedOn w:val="BodyText"/>
@@ -13024,6 +13058,126 @@
       <w:sz w:val="20"/>
       <w:szCs w:val="20"/>
       <w:color w:val="528F4A"/>
+      <w:b w:val="0"/>
+    </w:rPr>
+  </w:style>
+  <w:style w:type="character" w:customStyle="1" w:styleId="DivLabelProcess">
+    <w:name w:val="Div Label Process"/>
+    <w:rPr>
+      <w:rFonts w:ascii="Roboto Condensed" w:hAnsi="Roboto Condensed" w:eastAsia="Roboto Condensed" w:cs="Roboto Condensed"/>
+      <w:sz w:val="20"/>
+      <w:szCs w:val="20"/>
+      <w:color w:val="3F6EB4"/>
+      <w:b w:val="0"/>
+    </w:rPr>
+  </w:style>
+  <w:style w:type="character" w:customStyle="1" w:styleId="DivLabelLanguage">
+    <w:name w:val="Div Label Language"/>
+    <w:rPr>
+      <w:rFonts w:ascii="Roboto Condensed" w:hAnsi="Roboto Condensed" w:eastAsia="Roboto Condensed" w:cs="Roboto Condensed"/>
+      <w:sz w:val="20"/>
+      <w:szCs w:val="20"/>
+      <w:color w:val="56768C"/>
+      <w:b w:val="0"/>
+    </w:rPr>
+  </w:style>
+  <w:style w:type="character" w:customStyle="1" w:styleId="DivLabelPrinciple">
+    <w:name w:val="Div Label Principle"/>
+    <w:rPr>
+      <w:rFonts w:ascii="Roboto Condensed" w:hAnsi="Roboto Condensed" w:eastAsia="Roboto Condensed" w:cs="Roboto Condensed"/>
+      <w:sz w:val="20"/>
+      <w:szCs w:val="20"/>
+      <w:color w:val="3F6EB4"/>
+      <w:b w:val="0"/>
+    </w:rPr>
+  </w:style>
+  <w:style w:type="character" w:customStyle="1" w:styleId="DivLabelTransfer">
+    <w:name w:val="Div Label Transfer"/>
+    <w:rPr>
+      <w:rFonts w:ascii="Roboto Condensed" w:hAnsi="Roboto Condensed" w:eastAsia="Roboto Condensed" w:cs="Roboto Condensed"/>
+      <w:sz w:val="20"/>
+      <w:szCs w:val="20"/>
+      <w:color w:val="C47D2A"/>
+      <w:b w:val="0"/>
+    </w:rPr>
+  </w:style>
+  <w:style w:type="character" w:customStyle="1" w:styleId="DivLabelTeaching">
+    <w:name w:val="Div Label Teaching"/>
+    <w:rPr>
+      <w:rFonts w:ascii="Roboto Condensed" w:hAnsi="Roboto Condensed" w:eastAsia="Roboto Condensed" w:cs="Roboto Condensed"/>
+      <w:sz w:val="20"/>
+      <w:szCs w:val="20"/>
+      <w:color w:val="3F6EB4"/>
+      <w:b w:val="0"/>
+    </w:rPr>
+  </w:style>
+  <w:style w:type="character" w:customStyle="1" w:styleId="DivLabelNote">
+    <w:name w:val="Div Label Note"/>
+    <w:rPr>
+      <w:rFonts w:ascii="Roboto Condensed" w:hAnsi="Roboto Condensed" w:eastAsia="Roboto Condensed" w:cs="Roboto Condensed"/>
+      <w:sz w:val="20"/>
+      <w:szCs w:val="20"/>
+      <w:color w:val="6E6E6E"/>
+      <w:b w:val="0"/>
+    </w:rPr>
+  </w:style>
+  <w:style w:type="character" w:customStyle="1" w:styleId="DivLabelBad">
+    <w:name w:val="Div Label Bad"/>
+    <w:rPr>
+      <w:rFonts w:ascii="Roboto Condensed Medium" w:hAnsi="Roboto Condensed Medium" w:eastAsia="Roboto Condensed Medium" w:cs="Roboto Condensed Medium"/>
+      <w:sz w:val="20"/>
+      <w:szCs w:val="20"/>
+      <w:color w:val="B03E3E"/>
+      <w:b w:val="0"/>
+    </w:rPr>
+  </w:style>
+  <w:style w:type="character" w:customStyle="1" w:styleId="DivLabelGood">
+    <w:name w:val="Div Label Good"/>
+    <w:rPr>
+      <w:rFonts w:ascii="Roboto Condensed Medium" w:hAnsi="Roboto Condensed Medium" w:eastAsia="Roboto Condensed Medium" w:cs="Roboto Condensed Medium"/>
+      <w:sz w:val="20"/>
+      <w:szCs w:val="20"/>
+      <w:color w:val="528F4A"/>
+      <w:b w:val="0"/>
+    </w:rPr>
+  </w:style>
+  <w:style w:type="character" w:customStyle="1" w:styleId="DivLabelWorkedExample">
+    <w:name w:val="Div Label Worked Example"/>
+    <w:rPr>
+      <w:rFonts w:ascii="Roboto Condensed" w:hAnsi="Roboto Condensed" w:eastAsia="Roboto Condensed" w:cs="Roboto Condensed"/>
+      <w:sz w:val="20"/>
+      <w:szCs w:val="20"/>
+      <w:color w:val="56768C"/>
+      <w:b w:val="0"/>
+    </w:rPr>
+  </w:style>
+  <w:style w:type="character" w:customStyle="1" w:styleId="DivLabelExample">
+    <w:name w:val="Div Label Example"/>
+    <w:rPr>
+      <w:rFonts w:ascii="Roboto Condensed" w:hAnsi="Roboto Condensed" w:eastAsia="Roboto Condensed" w:cs="Roboto Condensed"/>
+      <w:sz w:val="20"/>
+      <w:szCs w:val="20"/>
+      <w:color w:val="6E6E6E"/>
+      <w:b w:val="0"/>
+    </w:rPr>
+  </w:style>
+  <w:style w:type="character" w:customStyle="1" w:styleId="DivLabelPlaceholder">
+    <w:name w:val="Div Label Placeholder"/>
+    <w:rPr>
+      <w:rFonts w:ascii="Consolas" w:hAnsi="Consolas" w:eastAsia="Consolas" w:cs="Consolas"/>
+      <w:sz w:val="16"/>
+      <w:szCs w:val="16"/>
+      <w:color w:val="6E6E6E"/>
+      <w:b w:val="0"/>
+    </w:rPr>
+  </w:style>
+  <w:style w:type="character" w:customStyle="1" w:styleId="DivLabelSelf-Stuy">
+    <w:name w:val="Div Label Self-Stuy"/>
+    <w:rPr>
+      <w:rFonts w:ascii="Roboto Condensed" w:hAnsi="Roboto Condensed" w:eastAsia="Roboto Condensed" w:cs="Roboto Condensed"/>
+      <w:sz w:val="20"/>
+      <w:szCs w:val="20"/>
+      <w:color w:val="6E6E6E"/>
       <w:b w:val="0"/>
     </w:rPr>
   </w:style>

</xml_diff>

<commit_message>
normalised many headings and activiities in the advanced book to reducy the sheer volume of div class types.
</commit_message>
<xml_diff>
--- a/adv/edits & guides/style edits/step2-stylereference/aw_textbook_clean_reference.docx
+++ b/adv/edits & guides/style edits/step2-stylereference/aw_textbook_clean_reference.docx
@@ -12730,6 +12730,346 @@
     </w:rPr>
     <w:link w:val="LearnNote"/>
   </w:style>
+  <w:style w:type="paragraph" w:customStyle="1" w:styleId="GuidanceStep">
+    <w:name w:val="Guidance Step"/>
+    <w:basedOn w:val="BodyText"/>
+    <w:next w:val="BodyText"/>
+    <w:rPr>
+      <w:rFonts w:ascii="Congenial" w:hAnsi="Congenial" w:eastAsia="Congenial" w:cs="Congenial"/>
+      <w:sz w:val="20"/>
+      <w:szCs w:val="20"/>
+      <w:color w:val="2D2D2D"/>
+      <w:b w:val="0"/>
+    </w:rPr>
+    <w:pPr>
+      <w:spacing w:before="160" w:after="160" w:line="276" w:lineRule="auto"/>
+      <w:ind w:left="198" w:right="0"/>
+      <w:jc w:val="left"/>
+      <w:widowControl/>
+      <w:shd w:val="clear" w:fill="F4F7FA"/>
+      <w:pBdr>
+        <w:left w:val="single" w:sz="36" w:space="3" w:color="56768C"/>
+      </w:pBdr>
+    </w:pPr>
+    <w:link w:val="GuidanceStepChar"/>
+  </w:style>
+  <w:style w:type="character" w:customStyle="1" w:styleId="GuidanceStepChar">
+    <w:name w:val="Guidance Step Char"/>
+    <w:rPr>
+      <w:rFonts w:ascii="Congenial" w:hAnsi="Congenial" w:eastAsia="Congenial" w:cs="Congenial"/>
+      <w:sz w:val="20"/>
+      <w:szCs w:val="20"/>
+      <w:color w:val="2D2D2D"/>
+      <w:b w:val="0"/>
+    </w:rPr>
+    <w:link w:val="GuidanceStep"/>
+  </w:style>
+  <w:style w:type="paragraph" w:customStyle="1" w:styleId="ReferenceSupport">
+    <w:name w:val="Reference Support"/>
+    <w:basedOn w:val="BodyText"/>
+    <w:next w:val="BodyText"/>
+    <w:rPr>
+      <w:rFonts w:ascii="Congenial" w:hAnsi="Congenial" w:eastAsia="Congenial" w:cs="Congenial"/>
+      <w:sz w:val="20"/>
+      <w:szCs w:val="20"/>
+      <w:color w:val="2D2D2D"/>
+      <w:b w:val="0"/>
+    </w:rPr>
+    <w:pPr>
+      <w:spacing w:before="160" w:after="160" w:line="276" w:lineRule="auto"/>
+      <w:ind w:left="198" w:right="0"/>
+      <w:jc w:val="left"/>
+      <w:widowControl/>
+      <w:shd w:val="clear" w:fill="F7F7F7"/>
+      <w:pBdr>
+        <w:left w:val="single" w:sz="24" w:space="3" w:color="969696"/>
+      </w:pBdr>
+    </w:pPr>
+    <w:link w:val="ReferenceSupportChar"/>
+  </w:style>
+  <w:style w:type="character" w:customStyle="1" w:styleId="ReferenceSupportChar">
+    <w:name w:val="Reference Support Char"/>
+    <w:rPr>
+      <w:rFonts w:ascii="Congenial" w:hAnsi="Congenial" w:eastAsia="Congenial" w:cs="Congenial"/>
+      <w:sz w:val="20"/>
+      <w:szCs w:val="20"/>
+      <w:color w:val="2D2D2D"/>
+      <w:b w:val="0"/>
+    </w:rPr>
+    <w:link w:val="ReferenceSupport"/>
+  </w:style>
+  <w:style w:type="paragraph" w:customStyle="1" w:styleId="RubricAssessment">
+    <w:name w:val="Rubric Assessment"/>
+    <w:basedOn w:val="BodyText"/>
+    <w:next w:val="BodyText"/>
+    <w:rPr>
+      <w:rFonts w:ascii="Congenial" w:hAnsi="Congenial" w:eastAsia="Congenial" w:cs="Congenial"/>
+      <w:sz w:val="20"/>
+      <w:szCs w:val="20"/>
+      <w:color w:val="2D2D2D"/>
+      <w:b w:val="0"/>
+    </w:rPr>
+    <w:pPr>
+      <w:spacing w:before="160" w:after="160" w:line="276" w:lineRule="auto"/>
+      <w:ind w:left="198" w:right="0"/>
+      <w:jc w:val="left"/>
+      <w:widowControl/>
+      <w:shd w:val="clear" w:fill="F2F8F1"/>
+      <w:pBdr>
+        <w:left w:val="single" w:sz="36" w:space="3" w:color="528F4A"/>
+      </w:pBdr>
+    </w:pPr>
+    <w:link w:val="RubricAssessmentChar"/>
+  </w:style>
+  <w:style w:type="character" w:customStyle="1" w:styleId="RubricAssessmentChar">
+    <w:name w:val="Rubric Assessment Char"/>
+    <w:rPr>
+      <w:rFonts w:ascii="Congenial" w:hAnsi="Congenial" w:eastAsia="Congenial" w:cs="Congenial"/>
+      <w:sz w:val="20"/>
+      <w:szCs w:val="20"/>
+      <w:color w:val="2D2D2D"/>
+      <w:b w:val="0"/>
+    </w:rPr>
+    <w:link w:val="RubricAssessment"/>
+  </w:style>
+  <w:style w:type="paragraph" w:customStyle="1" w:styleId="CourseMeta">
+    <w:name w:val="Course Meta"/>
+    <w:basedOn w:val="BodyText"/>
+    <w:next w:val="BodyText"/>
+    <w:rPr>
+      <w:rFonts w:ascii="Congenial" w:hAnsi="Congenial" w:eastAsia="Congenial" w:cs="Congenial"/>
+      <w:sz w:val="20"/>
+      <w:szCs w:val="20"/>
+      <w:color w:val="2D2D2D"/>
+      <w:b w:val="0"/>
+    </w:rPr>
+    <w:pPr>
+      <w:spacing w:before="160" w:after="160" w:line="276" w:lineRule="auto"/>
+      <w:ind w:left="198" w:right="0"/>
+      <w:jc w:val="left"/>
+      <w:widowControl/>
+      <w:shd w:val="clear" w:fill="F7F7F7"/>
+      <w:pBdr>
+        <w:left w:val="single" w:sz="24" w:space="3" w:color="969696"/>
+      </w:pBdr>
+    </w:pPr>
+    <w:link w:val="CourseMetaChar"/>
+  </w:style>
+  <w:style w:type="character" w:customStyle="1" w:styleId="CourseMetaChar">
+    <w:name w:val="Course Meta Char"/>
+    <w:rPr>
+      <w:rFonts w:ascii="Congenial" w:hAnsi="Congenial" w:eastAsia="Congenial" w:cs="Congenial"/>
+      <w:sz w:val="20"/>
+      <w:szCs w:val="20"/>
+      <w:color w:val="2D2D2D"/>
+      <w:b w:val="0"/>
+    </w:rPr>
+    <w:link w:val="CourseMeta"/>
+  </w:style>
+  <w:style w:type="paragraph" w:customStyle="1" w:styleId="ActivityInput">
+    <w:name w:val="Activity Input"/>
+    <w:basedOn w:val="BodyText"/>
+    <w:next w:val="BodyText"/>
+    <w:rPr>
+      <w:rFonts w:ascii="Congenial" w:hAnsi="Congenial" w:eastAsia="Congenial" w:cs="Congenial"/>
+      <w:sz w:val="20"/>
+      <w:szCs w:val="20"/>
+      <w:color w:val="2D2D2D"/>
+      <w:b w:val="0"/>
+    </w:rPr>
+    <w:pPr>
+      <w:spacing w:before="200" w:after="200" w:line="288" w:lineRule="auto"/>
+      <w:ind w:left="198" w:right="0"/>
+      <w:jc w:val="left"/>
+      <w:widowControl/>
+      <w:shd w:val="clear" w:fill="F1F6F9"/>
+      <w:pBdr>
+        <w:left w:val="single" w:sz="36" w:space="3" w:color="56768C"/>
+      </w:pBdr>
+    </w:pPr>
+    <w:link w:val="ActivityInputChar"/>
+  </w:style>
+  <w:style w:type="character" w:customStyle="1" w:styleId="ActivityInputChar">
+    <w:name w:val="Activity Input Char"/>
+    <w:rPr>
+      <w:rFonts w:ascii="Congenial" w:hAnsi="Congenial" w:eastAsia="Congenial" w:cs="Congenial"/>
+      <w:sz w:val="20"/>
+      <w:szCs w:val="20"/>
+      <w:color w:val="2D2D2D"/>
+      <w:b w:val="0"/>
+    </w:rPr>
+    <w:link w:val="ActivityInput"/>
+  </w:style>
+  <w:style w:type="paragraph" w:customStyle="1" w:styleId="ActivityAnalysis">
+    <w:name w:val="Activity Analysis"/>
+    <w:basedOn w:val="BodyText"/>
+    <w:next w:val="BodyText"/>
+    <w:rPr>
+      <w:rFonts w:ascii="Congenial" w:hAnsi="Congenial" w:eastAsia="Congenial" w:cs="Congenial"/>
+      <w:sz w:val="20"/>
+      <w:szCs w:val="20"/>
+      <w:color w:val="2D2D2D"/>
+      <w:b w:val="0"/>
+    </w:rPr>
+    <w:pPr>
+      <w:spacing w:before="200" w:after="200" w:line="288" w:lineRule="auto"/>
+      <w:ind w:left="198" w:right="0"/>
+      <w:jc w:val="left"/>
+      <w:widowControl/>
+      <w:shd w:val="clear" w:fill="F2F7FC"/>
+      <w:pBdr>
+        <w:left w:val="single" w:sz="36" w:space="3" w:color="3F6EB4"/>
+      </w:pBdr>
+    </w:pPr>
+    <w:link w:val="ActivityAnalysisChar"/>
+  </w:style>
+  <w:style w:type="character" w:customStyle="1" w:styleId="ActivityAnalysisChar">
+    <w:name w:val="Activity Analysis Char"/>
+    <w:rPr>
+      <w:rFonts w:ascii="Congenial" w:hAnsi="Congenial" w:eastAsia="Congenial" w:cs="Congenial"/>
+      <w:sz w:val="20"/>
+      <w:szCs w:val="20"/>
+      <w:color w:val="2D2D2D"/>
+      <w:b w:val="0"/>
+    </w:rPr>
+    <w:link w:val="ActivityAnalysis"/>
+  </w:style>
+  <w:style w:type="paragraph" w:customStyle="1" w:styleId="ActivityLanguageControl">
+    <w:name w:val="Activity Language Control"/>
+    <w:basedOn w:val="BodyText"/>
+    <w:next w:val="BodyText"/>
+    <w:rPr>
+      <w:rFonts w:ascii="Congenial" w:hAnsi="Congenial" w:eastAsia="Congenial" w:cs="Congenial"/>
+      <w:sz w:val="20"/>
+      <w:szCs w:val="20"/>
+      <w:color w:val="2D2D2D"/>
+      <w:b w:val="0"/>
+    </w:rPr>
+    <w:pPr>
+      <w:spacing w:before="200" w:after="200" w:line="288" w:lineRule="auto"/>
+      <w:ind w:left="198" w:right="0"/>
+      <w:jc w:val="left"/>
+      <w:widowControl/>
+      <w:shd w:val="clear" w:fill="EEF8F6"/>
+      <w:pBdr>
+        <w:left w:val="single" w:sz="36" w:space="3" w:color="3E867C"/>
+      </w:pBdr>
+    </w:pPr>
+    <w:link w:val="ActivityLanguageControlChar"/>
+  </w:style>
+  <w:style w:type="character" w:customStyle="1" w:styleId="ActivityLanguageControlChar">
+    <w:name w:val="Activity Language Control Char"/>
+    <w:rPr>
+      <w:rFonts w:ascii="Congenial" w:hAnsi="Congenial" w:eastAsia="Congenial" w:cs="Congenial"/>
+      <w:sz w:val="20"/>
+      <w:szCs w:val="20"/>
+      <w:color w:val="2D2D2D"/>
+      <w:b w:val="0"/>
+    </w:rPr>
+    <w:link w:val="ActivityLanguageControl"/>
+  </w:style>
+  <w:style w:type="paragraph" w:customStyle="1" w:styleId="ActivityRewrite">
+    <w:name w:val="Activity Rewrite"/>
+    <w:basedOn w:val="BodyText"/>
+    <w:next w:val="BodyText"/>
+    <w:rPr>
+      <w:rFonts w:ascii="Congenial" w:hAnsi="Congenial" w:eastAsia="Congenial" w:cs="Congenial"/>
+      <w:sz w:val="20"/>
+      <w:szCs w:val="20"/>
+      <w:color w:val="2D2D2D"/>
+      <w:b w:val="0"/>
+    </w:rPr>
+    <w:pPr>
+      <w:spacing w:before="200" w:after="200" w:line="288" w:lineRule="auto"/>
+      <w:ind w:left="198" w:right="0"/>
+      <w:jc w:val="left"/>
+      <w:widowControl/>
+      <w:shd w:val="clear" w:fill="F4F1FB"/>
+      <w:pBdr>
+        <w:left w:val="single" w:sz="36" w:space="3" w:color="7561A8"/>
+      </w:pBdr>
+    </w:pPr>
+    <w:link w:val="ActivityRewriteChar"/>
+  </w:style>
+  <w:style w:type="character" w:customStyle="1" w:styleId="ActivityRewriteChar">
+    <w:name w:val="Activity Rewrite Char"/>
+    <w:rPr>
+      <w:rFonts w:ascii="Congenial" w:hAnsi="Congenial" w:eastAsia="Congenial" w:cs="Congenial"/>
+      <w:sz w:val="20"/>
+      <w:szCs w:val="20"/>
+      <w:color w:val="2D2D2D"/>
+      <w:b w:val="0"/>
+    </w:rPr>
+    <w:link w:val="ActivityRewrite"/>
+  </w:style>
+  <w:style w:type="paragraph" w:customStyle="1" w:styleId="ActivityEdit">
+    <w:name w:val="Activity Edit"/>
+    <w:basedOn w:val="BodyText"/>
+    <w:next w:val="BodyText"/>
+    <w:rPr>
+      <w:rFonts w:ascii="Congenial" w:hAnsi="Congenial" w:eastAsia="Congenial" w:cs="Congenial"/>
+      <w:sz w:val="20"/>
+      <w:szCs w:val="20"/>
+      <w:color w:val="2D2D2D"/>
+      <w:b w:val="0"/>
+    </w:rPr>
+    <w:pPr>
+      <w:spacing w:before="200" w:after="200" w:line="288" w:lineRule="auto"/>
+      <w:ind w:left="198" w:right="0"/>
+      <w:jc w:val="left"/>
+      <w:widowControl/>
+      <w:shd w:val="clear" w:fill="FDF8F0"/>
+      <w:pBdr>
+        <w:left w:val="single" w:sz="36" w:space="3" w:color="C47D2A"/>
+      </w:pBdr>
+    </w:pPr>
+    <w:link w:val="ActivityEditChar"/>
+  </w:style>
+  <w:style w:type="character" w:customStyle="1" w:styleId="ActivityEditChar">
+    <w:name w:val="Activity Edit Char"/>
+    <w:rPr>
+      <w:rFonts w:ascii="Congenial" w:hAnsi="Congenial" w:eastAsia="Congenial" w:cs="Congenial"/>
+      <w:sz w:val="20"/>
+      <w:szCs w:val="20"/>
+      <w:color w:val="2D2D2D"/>
+      <w:b w:val="0"/>
+    </w:rPr>
+    <w:link w:val="ActivityEdit"/>
+  </w:style>
+  <w:style w:type="paragraph" w:customStyle="1" w:styleId="ActivityDraft">
+    <w:name w:val="Activity Draft"/>
+    <w:basedOn w:val="BodyText"/>
+    <w:next w:val="BodyText"/>
+    <w:rPr>
+      <w:rFonts w:ascii="Congenial" w:hAnsi="Congenial" w:eastAsia="Congenial" w:cs="Congenial"/>
+      <w:sz w:val="20"/>
+      <w:szCs w:val="20"/>
+      <w:color w:val="2D2D2D"/>
+      <w:b w:val="0"/>
+    </w:rPr>
+    <w:pPr>
+      <w:spacing w:before="200" w:after="200" w:line="288" w:lineRule="auto"/>
+      <w:ind w:left="198" w:right="0"/>
+      <w:jc w:val="left"/>
+      <w:widowControl/>
+      <w:shd w:val="clear" w:fill="F4FAF2"/>
+      <w:pBdr>
+        <w:left w:val="single" w:sz="36" w:space="3" w:color="528F4A"/>
+      </w:pBdr>
+    </w:pPr>
+    <w:link w:val="ActivityDraftChar"/>
+  </w:style>
+  <w:style w:type="character" w:customStyle="1" w:styleId="ActivityDraftChar">
+    <w:name w:val="Activity Draft Char"/>
+    <w:rPr>
+      <w:rFonts w:ascii="Congenial" w:hAnsi="Congenial" w:eastAsia="Congenial" w:cs="Congenial"/>
+      <w:sz w:val="20"/>
+      <w:szCs w:val="20"/>
+      <w:color w:val="2D2D2D"/>
+      <w:b w:val="0"/>
+    </w:rPr>
+    <w:link w:val="ActivityDraft"/>
+  </w:style>
   <w:style w:type="paragraph" w:customStyle="1" w:styleId="Model">
     <w:name w:val="Model"/>
     <w:basedOn w:val="BodyText"/>
@@ -13061,8 +13401,8 @@
       <w:b w:val="0"/>
     </w:rPr>
   </w:style>
-  <w:style w:type="character" w:customStyle="1" w:styleId="DivLabelProcess">
-    <w:name w:val="Div Label Process"/>
+  <w:style w:type="character" w:customStyle="1" w:styleId="DivLabelProcessChar">
+    <w:name w:val="Div Label Process Char"/>
     <w:rPr>
       <w:rFonts w:ascii="Roboto Condensed" w:hAnsi="Roboto Condensed" w:eastAsia="Roboto Condensed" w:cs="Roboto Condensed"/>
       <w:sz w:val="20"/>
@@ -13071,8 +13411,8 @@
       <w:b w:val="0"/>
     </w:rPr>
   </w:style>
-  <w:style w:type="character" w:customStyle="1" w:styleId="DivLabelLanguage">
-    <w:name w:val="Div Label Language"/>
+  <w:style w:type="character" w:customStyle="1" w:styleId="DivLabelLanguageChar">
+    <w:name w:val="Div Label Language Char"/>
     <w:rPr>
       <w:rFonts w:ascii="Roboto Condensed" w:hAnsi="Roboto Condensed" w:eastAsia="Roboto Condensed" w:cs="Roboto Condensed"/>
       <w:sz w:val="20"/>
@@ -13081,8 +13421,8 @@
       <w:b w:val="0"/>
     </w:rPr>
   </w:style>
-  <w:style w:type="character" w:customStyle="1" w:styleId="DivLabelPrinciple">
-    <w:name w:val="Div Label Principle"/>
+  <w:style w:type="character" w:customStyle="1" w:styleId="DivLabelPrincipleChar">
+    <w:name w:val="Div Label Principle Char"/>
     <w:rPr>
       <w:rFonts w:ascii="Roboto Condensed" w:hAnsi="Roboto Condensed" w:eastAsia="Roboto Condensed" w:cs="Roboto Condensed"/>
       <w:sz w:val="20"/>
@@ -13091,8 +13431,8 @@
       <w:b w:val="0"/>
     </w:rPr>
   </w:style>
-  <w:style w:type="character" w:customStyle="1" w:styleId="DivLabelTransfer">
-    <w:name w:val="Div Label Transfer"/>
+  <w:style w:type="character" w:customStyle="1" w:styleId="DivLabelTransferChar">
+    <w:name w:val="Div Label Transfer Char"/>
     <w:rPr>
       <w:rFonts w:ascii="Roboto Condensed" w:hAnsi="Roboto Condensed" w:eastAsia="Roboto Condensed" w:cs="Roboto Condensed"/>
       <w:sz w:val="20"/>
@@ -13101,8 +13441,8 @@
       <w:b w:val="0"/>
     </w:rPr>
   </w:style>
-  <w:style w:type="character" w:customStyle="1" w:styleId="DivLabelTeaching">
-    <w:name w:val="Div Label Teaching"/>
+  <w:style w:type="character" w:customStyle="1" w:styleId="DivLabelTeachingChar">
+    <w:name w:val="Div Label Teaching Char"/>
     <w:rPr>
       <w:rFonts w:ascii="Roboto Condensed" w:hAnsi="Roboto Condensed" w:eastAsia="Roboto Condensed" w:cs="Roboto Condensed"/>
       <w:sz w:val="20"/>
@@ -13111,8 +13451,8 @@
       <w:b w:val="0"/>
     </w:rPr>
   </w:style>
-  <w:style w:type="character" w:customStyle="1" w:styleId="DivLabelNote">
-    <w:name w:val="Div Label Note"/>
+  <w:style w:type="character" w:customStyle="1" w:styleId="DivLabelNoteChar">
+    <w:name w:val="Div Label Note Char"/>
     <w:rPr>
       <w:rFonts w:ascii="Roboto Condensed" w:hAnsi="Roboto Condensed" w:eastAsia="Roboto Condensed" w:cs="Roboto Condensed"/>
       <w:sz w:val="20"/>
@@ -13121,8 +13461,118 @@
       <w:b w:val="0"/>
     </w:rPr>
   </w:style>
-  <w:style w:type="character" w:customStyle="1" w:styleId="DivLabelBad">
-    <w:name w:val="Div Label Bad"/>
+  <w:style w:type="character" w:customStyle="1" w:styleId="DivLabelGuidanceStepChar">
+    <w:name w:val="Div Label Guidance Step Char"/>
+    <w:rPr>
+      <w:rFonts w:ascii="Roboto Condensed" w:hAnsi="Roboto Condensed" w:eastAsia="Roboto Condensed" w:cs="Roboto Condensed"/>
+      <w:sz w:val="20"/>
+      <w:szCs w:val="20"/>
+      <w:color w:val="56768C"/>
+      <w:b w:val="0"/>
+    </w:rPr>
+  </w:style>
+  <w:style w:type="character" w:customStyle="1" w:styleId="DivLabelReferenceSupportChar">
+    <w:name w:val="Div Label Reference Support Char"/>
+    <w:rPr>
+      <w:rFonts w:ascii="Roboto Condensed" w:hAnsi="Roboto Condensed" w:eastAsia="Roboto Condensed" w:cs="Roboto Condensed"/>
+      <w:sz w:val="20"/>
+      <w:szCs w:val="20"/>
+      <w:color w:val="6E6E6E"/>
+      <w:b w:val="0"/>
+    </w:rPr>
+  </w:style>
+  <w:style w:type="character" w:customStyle="1" w:styleId="DivLabelRubricAssessmentChar">
+    <w:name w:val="Div Label Rubric Assessment Char"/>
+    <w:rPr>
+      <w:rFonts w:ascii="Roboto Condensed" w:hAnsi="Roboto Condensed" w:eastAsia="Roboto Condensed" w:cs="Roboto Condensed"/>
+      <w:sz w:val="20"/>
+      <w:szCs w:val="20"/>
+      <w:color w:val="528F4A"/>
+      <w:b w:val="0"/>
+    </w:rPr>
+  </w:style>
+  <w:style w:type="character" w:customStyle="1" w:styleId="DivLabelCourseMetaChar">
+    <w:name w:val="Div Label Course Meta Char"/>
+    <w:rPr>
+      <w:rFonts w:ascii="Roboto Condensed" w:hAnsi="Roboto Condensed" w:eastAsia="Roboto Condensed" w:cs="Roboto Condensed"/>
+      <w:sz w:val="20"/>
+      <w:szCs w:val="20"/>
+      <w:color w:val="6E6E6E"/>
+      <w:b w:val="0"/>
+    </w:rPr>
+  </w:style>
+  <w:style w:type="character" w:customStyle="1" w:styleId="DivLabelActivityInputChar">
+    <w:name w:val="Div Label Activity Input Char"/>
+    <w:rPr>
+      <w:rFonts w:ascii="Roboto Condensed" w:hAnsi="Roboto Condensed" w:eastAsia="Roboto Condensed" w:cs="Roboto Condensed"/>
+      <w:sz w:val="20"/>
+      <w:szCs w:val="20"/>
+      <w:color w:val="56768C"/>
+      <w:b w:val="0"/>
+    </w:rPr>
+  </w:style>
+  <w:style w:type="character" w:customStyle="1" w:styleId="DivLabelActivityAnalysisChar">
+    <w:name w:val="Div Label Activity Analysis Char"/>
+    <w:rPr>
+      <w:rFonts w:ascii="Roboto Condensed" w:hAnsi="Roboto Condensed" w:eastAsia="Roboto Condensed" w:cs="Roboto Condensed"/>
+      <w:sz w:val="20"/>
+      <w:szCs w:val="20"/>
+      <w:color w:val="3F6EB4"/>
+      <w:b w:val="0"/>
+    </w:rPr>
+  </w:style>
+  <w:style w:type="character" w:customStyle="1" w:styleId="DivLabelActivityLanguageControlChar">
+    <w:name w:val="Div Label Activity Language Control Char"/>
+    <w:rPr>
+      <w:rFonts w:ascii="Roboto Condensed" w:hAnsi="Roboto Condensed" w:eastAsia="Roboto Condensed" w:cs="Roboto Condensed"/>
+      <w:sz w:val="20"/>
+      <w:szCs w:val="20"/>
+      <w:color w:val="3E867C"/>
+      <w:b w:val="0"/>
+    </w:rPr>
+  </w:style>
+  <w:style w:type="character" w:customStyle="1" w:styleId="DivLabelActivityRewriteChar">
+    <w:name w:val="Div Label Activity Rewrite Char"/>
+    <w:rPr>
+      <w:rFonts w:ascii="Roboto Condensed" w:hAnsi="Roboto Condensed" w:eastAsia="Roboto Condensed" w:cs="Roboto Condensed"/>
+      <w:sz w:val="20"/>
+      <w:szCs w:val="20"/>
+      <w:color w:val="7561A8"/>
+      <w:b w:val="0"/>
+    </w:rPr>
+  </w:style>
+  <w:style w:type="character" w:customStyle="1" w:styleId="DivLabelActivityEditChar">
+    <w:name w:val="Div Label Activity Edit Char"/>
+    <w:rPr>
+      <w:rFonts w:ascii="Roboto Condensed" w:hAnsi="Roboto Condensed" w:eastAsia="Roboto Condensed" w:cs="Roboto Condensed"/>
+      <w:sz w:val="20"/>
+      <w:szCs w:val="20"/>
+      <w:color w:val="C47D2A"/>
+      <w:b w:val="0"/>
+    </w:rPr>
+  </w:style>
+  <w:style w:type="character" w:customStyle="1" w:styleId="DivLabelActivityDraftChar">
+    <w:name w:val="Div Label Activity Draft Char"/>
+    <w:rPr>
+      <w:rFonts w:ascii="Roboto Condensed" w:hAnsi="Roboto Condensed" w:eastAsia="Roboto Condensed" w:cs="Roboto Condensed"/>
+      <w:sz w:val="20"/>
+      <w:szCs w:val="20"/>
+      <w:color w:val="528F4A"/>
+      <w:b w:val="0"/>
+    </w:rPr>
+  </w:style>
+  <w:style w:type="character" w:customStyle="1" w:styleId="DivLabelModelChar">
+    <w:name w:val="Div Label Model Char"/>
+    <w:rPr>
+      <w:rFonts w:ascii="Roboto Condensed" w:hAnsi="Roboto Condensed" w:eastAsia="Roboto Condensed" w:cs="Roboto Condensed"/>
+      <w:sz w:val="20"/>
+      <w:szCs w:val="20"/>
+      <w:color w:val="56768C"/>
+      <w:b w:val="0"/>
+    </w:rPr>
+  </w:style>
+  <w:style w:type="character" w:customStyle="1" w:styleId="DivLabelBadChar">
+    <w:name w:val="Div Label Bad Char"/>
     <w:rPr>
       <w:rFonts w:ascii="Roboto Condensed Medium" w:hAnsi="Roboto Condensed Medium" w:eastAsia="Roboto Condensed Medium" w:cs="Roboto Condensed Medium"/>
       <w:sz w:val="20"/>
@@ -13131,8 +13581,8 @@
       <w:b w:val="0"/>
     </w:rPr>
   </w:style>
-  <w:style w:type="character" w:customStyle="1" w:styleId="DivLabelGood">
-    <w:name w:val="Div Label Good"/>
+  <w:style w:type="character" w:customStyle="1" w:styleId="DivLabelGoodChar">
+    <w:name w:val="Div Label Good Char"/>
     <w:rPr>
       <w:rFonts w:ascii="Roboto Condensed Medium" w:hAnsi="Roboto Condensed Medium" w:eastAsia="Roboto Condensed Medium" w:cs="Roboto Condensed Medium"/>
       <w:sz w:val="20"/>
@@ -13141,8 +13591,8 @@
       <w:b w:val="0"/>
     </w:rPr>
   </w:style>
-  <w:style w:type="character" w:customStyle="1" w:styleId="DivLabelWorkedExample">
-    <w:name w:val="Div Label Worked Example"/>
+  <w:style w:type="character" w:customStyle="1" w:styleId="DivLabelWorkedExampleChar">
+    <w:name w:val="Div Label Worked Example Char"/>
     <w:rPr>
       <w:rFonts w:ascii="Roboto Condensed" w:hAnsi="Roboto Condensed" w:eastAsia="Roboto Condensed" w:cs="Roboto Condensed"/>
       <w:sz w:val="20"/>
@@ -13151,8 +13601,8 @@
       <w:b w:val="0"/>
     </w:rPr>
   </w:style>
-  <w:style w:type="character" w:customStyle="1" w:styleId="DivLabelExample">
-    <w:name w:val="Div Label Example"/>
+  <w:style w:type="character" w:customStyle="1" w:styleId="DivLabelBaseChar">
+    <w:name w:val="Div Label Base Char"/>
     <w:rPr>
       <w:rFonts w:ascii="Roboto Condensed" w:hAnsi="Roboto Condensed" w:eastAsia="Roboto Condensed" w:cs="Roboto Condensed"/>
       <w:sz w:val="20"/>
@@ -13161,18 +13611,8 @@
       <w:b w:val="0"/>
     </w:rPr>
   </w:style>
-  <w:style w:type="character" w:customStyle="1" w:styleId="DivLabelPlaceholder">
-    <w:name w:val="Div Label Placeholder"/>
-    <w:rPr>
-      <w:rFonts w:ascii="Consolas" w:hAnsi="Consolas" w:eastAsia="Consolas" w:cs="Consolas"/>
-      <w:sz w:val="16"/>
-      <w:szCs w:val="16"/>
-      <w:color w:val="6E6E6E"/>
-      <w:b w:val="0"/>
-    </w:rPr>
-  </w:style>
-  <w:style w:type="character" w:customStyle="1" w:styleId="DivLabelSelf-Stuy">
-    <w:name w:val="Div Label Self-Stuy"/>
+  <w:style w:type="character" w:customStyle="1" w:styleId="DivLabelSelf-StudyChar">
+    <w:name w:val="Div Label Self-Study Char"/>
     <w:rPr>
       <w:rFonts w:ascii="Roboto Condensed" w:hAnsi="Roboto Condensed" w:eastAsia="Roboto Condensed" w:cs="Roboto Condensed"/>
       <w:sz w:val="20"/>

</xml_diff>